<commit_message>
se corrigio nuevo oficio y por categorias en catalogos
</commit_message>
<xml_diff>
--- a/plantillas/oficio_camaras.docx
+++ b/plantillas/oficio_camaras.docx
@@ -42,33 +42,7 @@
           <w:szCs w:val="20"/>
           <w:lang w:val="es-ES_tradnl"/>
         </w:rPr>
-        <w:t>${</w:t>
-      </w:r>
-      <w:proofErr w:type="spellStart"/>
-      <w:r>
-        <w:rPr>
-          <w:rFonts w:ascii="Calibri" w:hAnsi="Calibri" w:cs="Arial"/>
-          <w:i/>
-          <w:iCs/>
-          <w:color w:val="333333"/>
-          <w:sz w:val="20"/>
-          <w:szCs w:val="20"/>
-          <w:lang w:val="es-ES_tradnl"/>
-        </w:rPr>
-        <w:t>nombre_oficial_ano</w:t>
-      </w:r>
-      <w:proofErr w:type="spellEnd"/>
-      <w:r>
-        <w:rPr>
-          <w:rFonts w:ascii="Calibri" w:hAnsi="Calibri" w:cs="Arial"/>
-          <w:i/>
-          <w:iCs/>
-          <w:color w:val="333333"/>
-          <w:sz w:val="20"/>
-          <w:szCs w:val="20"/>
-          <w:lang w:val="es-ES_tradnl"/>
-        </w:rPr>
-        <w:t>}</w:t>
+        <w:t>${nombre_oficial_ano}</w:t>
       </w:r>
     </w:p>
     <w:p>
@@ -123,23 +97,7 @@
           <w:rFonts w:cs="Arial"/>
           <w:color w:val="000000" w:themeColor="text1"/>
         </w:rPr>
-        <w:t>${</w:t>
-      </w:r>
-      <w:proofErr w:type="spellStart"/>
-      <w:r>
-        <w:rPr>
-          <w:rFonts w:cs="Arial"/>
-          <w:color w:val="000000" w:themeColor="text1"/>
-        </w:rPr>
-        <w:t>oficio_fecha</w:t>
-      </w:r>
-      <w:proofErr w:type="spellEnd"/>
-      <w:r>
-        <w:rPr>
-          <w:rFonts w:cs="Arial"/>
-          <w:color w:val="000000" w:themeColor="text1"/>
-        </w:rPr>
-        <w:t>}</w:t>
+        <w:t>${oficio_fecha}</w:t>
       </w:r>
       <w:r>
         <w:rPr>
@@ -182,9 +140,8 @@
           <w:szCs w:val="30"/>
           <w:u w:val="single"/>
         </w:rPr>
-        <w:t xml:space="preserve">OFICIO </w:t>
-      </w:r>
-      <w:proofErr w:type="gramStart"/>
+        <w:t xml:space="preserve">OFICIO Nº  </w:t>
+      </w:r>
       <w:r>
         <w:rPr>
           <w:rFonts w:ascii="Impact" w:hAnsi="Impact" w:cs="Arial"/>
@@ -193,7 +150,7 @@
           <w:szCs w:val="30"/>
           <w:u w:val="single"/>
         </w:rPr>
-        <w:t xml:space="preserve">Nº  </w:t>
+        <w:t>${oficio_numero}</w:t>
       </w:r>
       <w:r>
         <w:rPr>
@@ -203,9 +160,8 @@
           <w:szCs w:val="30"/>
           <w:u w:val="single"/>
         </w:rPr>
-        <w:t>$</w:t>
-      </w:r>
-      <w:proofErr w:type="gramEnd"/>
+        <w:t>-</w:t>
+      </w:r>
       <w:r>
         <w:rPr>
           <w:rFonts w:ascii="Impact" w:hAnsi="Impact" w:cs="Arial"/>
@@ -214,71 +170,7 @@
           <w:szCs w:val="30"/>
           <w:u w:val="single"/>
         </w:rPr>
-        <w:t>{</w:t>
-      </w:r>
-      <w:proofErr w:type="spellStart"/>
-      <w:r>
-        <w:rPr>
-          <w:rFonts w:ascii="Impact" w:hAnsi="Impact" w:cs="Arial"/>
-          <w:color w:val="000000" w:themeColor="text1"/>
-          <w:sz w:val="30"/>
-          <w:szCs w:val="30"/>
-          <w:u w:val="single"/>
-        </w:rPr>
-        <w:t>oficio_numero</w:t>
-      </w:r>
-      <w:proofErr w:type="spellEnd"/>
-      <w:r>
-        <w:rPr>
-          <w:rFonts w:ascii="Impact" w:hAnsi="Impact" w:cs="Arial"/>
-          <w:color w:val="000000" w:themeColor="text1"/>
-          <w:sz w:val="30"/>
-          <w:szCs w:val="30"/>
-          <w:u w:val="single"/>
-        </w:rPr>
-        <w:t>}</w:t>
-      </w:r>
-      <w:r>
-        <w:rPr>
-          <w:rFonts w:ascii="Impact" w:hAnsi="Impact" w:cs="Arial"/>
-          <w:color w:val="000000" w:themeColor="text1"/>
-          <w:sz w:val="30"/>
-          <w:szCs w:val="30"/>
-          <w:u w:val="single"/>
-        </w:rPr>
-        <w:t>-</w:t>
-      </w:r>
-      <w:r>
-        <w:rPr>
-          <w:rFonts w:ascii="Impact" w:hAnsi="Impact" w:cs="Arial"/>
-          <w:color w:val="000000" w:themeColor="text1"/>
-          <w:sz w:val="30"/>
-          <w:szCs w:val="30"/>
-          <w:u w:val="single"/>
-        </w:rPr>
-        <w:t>${</w:t>
-      </w:r>
-      <w:proofErr w:type="spellStart"/>
-      <w:r>
-        <w:rPr>
-          <w:rFonts w:ascii="Impact" w:hAnsi="Impact" w:cs="Arial"/>
-          <w:color w:val="000000" w:themeColor="text1"/>
-          <w:sz w:val="30"/>
-          <w:szCs w:val="30"/>
-          <w:u w:val="single"/>
-        </w:rPr>
-        <w:t>oficio_anio</w:t>
-      </w:r>
-      <w:proofErr w:type="spellEnd"/>
-      <w:r>
-        <w:rPr>
-          <w:rFonts w:ascii="Impact" w:hAnsi="Impact" w:cs="Arial"/>
-          <w:color w:val="000000" w:themeColor="text1"/>
-          <w:sz w:val="30"/>
-          <w:szCs w:val="30"/>
-          <w:u w:val="single"/>
-        </w:rPr>
-        <w:t>}</w:t>
+        <w:t>${oficio_anio}</w:t>
       </w:r>
       <w:r>
         <w:rPr>
@@ -351,25 +243,7 @@
           <w:bCs/>
           <w:color w:val="000000" w:themeColor="text1"/>
         </w:rPr>
-        <w:t>${</w:t>
-      </w:r>
-      <w:proofErr w:type="spellStart"/>
-      <w:r>
-        <w:rPr>
-          <w:b/>
-          <w:bCs/>
-          <w:color w:val="000000" w:themeColor="text1"/>
-        </w:rPr>
-        <w:t>oficio_grado_cargo</w:t>
-      </w:r>
-      <w:proofErr w:type="spellEnd"/>
-      <w:r>
-        <w:rPr>
-          <w:b/>
-          <w:bCs/>
-          <w:color w:val="000000" w:themeColor="text1"/>
-        </w:rPr>
-        <w:t>}</w:t>
+        <w:t>${oficio_grado_cargo}</w:t>
       </w:r>
     </w:p>
     <w:p>
@@ -406,25 +280,7 @@
           <w:bCs/>
           <w:color w:val="000000" w:themeColor="text1"/>
         </w:rPr>
-        <w:t>${</w:t>
-      </w:r>
-      <w:proofErr w:type="spellStart"/>
-      <w:r>
-        <w:rPr>
-          <w:b/>
-          <w:bCs/>
-          <w:color w:val="000000" w:themeColor="text1"/>
-        </w:rPr>
-        <w:t>oficio_persona_destino</w:t>
-      </w:r>
-      <w:proofErr w:type="spellEnd"/>
-      <w:r>
-        <w:rPr>
-          <w:b/>
-          <w:bCs/>
-          <w:color w:val="000000" w:themeColor="text1"/>
-        </w:rPr>
-        <w:t>}</w:t>
+        <w:t>${oficio_persona_destino}</w:t>
       </w:r>
     </w:p>
     <w:p>
@@ -456,25 +312,7 @@
           <w:bCs/>
           <w:color w:val="000000" w:themeColor="text1"/>
         </w:rPr>
-        <w:t>${</w:t>
-      </w:r>
-      <w:proofErr w:type="spellStart"/>
-      <w:r>
-        <w:rPr>
-          <w:b/>
-          <w:bCs/>
-          <w:color w:val="000000" w:themeColor="text1"/>
-        </w:rPr>
-        <w:t>entidad_nombre</w:t>
-      </w:r>
-      <w:proofErr w:type="spellEnd"/>
-      <w:r>
-        <w:rPr>
-          <w:b/>
-          <w:bCs/>
-          <w:color w:val="000000" w:themeColor="text1"/>
-        </w:rPr>
-        <w:t>}</w:t>
+        <w:t>${entidad_nombre}</w:t>
       </w:r>
     </w:p>
     <w:p>
@@ -554,7 +392,6 @@
         </w:rPr>
         <w:t>${</w:t>
       </w:r>
-      <w:proofErr w:type="spellStart"/>
       <w:r>
         <w:rPr>
           <w:rFonts w:cs="Arial"/>
@@ -565,7 +402,6 @@
         </w:rPr>
         <w:t>oficio_rango_desde</w:t>
       </w:r>
-      <w:proofErr w:type="spellEnd"/>
       <w:r>
         <w:rPr>
           <w:rFonts w:cs="Arial"/>
@@ -596,7 +432,6 @@
         </w:rPr>
         <w:t>${</w:t>
       </w:r>
-      <w:proofErr w:type="spellStart"/>
       <w:r>
         <w:rPr>
           <w:rFonts w:cs="Arial"/>
@@ -607,7 +442,6 @@
         </w:rPr>
         <w:t>oficio_rango_hasta</w:t>
       </w:r>
-      <w:proofErr w:type="spellEnd"/>
       <w:r>
         <w:rPr>
           <w:rFonts w:cs="Arial"/>
@@ -666,25 +500,7 @@
           <w:bCs/>
           <w:color w:val="000000" w:themeColor="text1"/>
         </w:rPr>
-        <w:t>${</w:t>
-      </w:r>
-      <w:proofErr w:type="spellStart"/>
-      <w:r>
-        <w:rPr>
-          <w:b/>
-          <w:bCs/>
-          <w:color w:val="000000" w:themeColor="text1"/>
-        </w:rPr>
-        <w:t>accidente_fecha_abrev</w:t>
-      </w:r>
-      <w:proofErr w:type="spellEnd"/>
-      <w:r>
-        <w:rPr>
-          <w:b/>
-          <w:bCs/>
-          <w:color w:val="000000" w:themeColor="text1"/>
-        </w:rPr>
-        <w:t>}</w:t>
+        <w:t>${accidente_fecha_abrev}</w:t>
       </w:r>
       <w:r>
         <w:rPr>
@@ -781,25 +597,23 @@
           <w:sz w:val="24"/>
           <w:szCs w:val="24"/>
         </w:rPr>
-        <w:t>${</w:t>
-      </w:r>
-      <w:proofErr w:type="spellStart"/>
+        <w:t>${accidente_lugar}</w:t>
+      </w:r>
       <w:r>
         <w:rPr>
           <w:rFonts w:ascii="Arial" w:hAnsi="Arial" w:cs="Arial"/>
           <w:sz w:val="24"/>
           <w:szCs w:val="24"/>
         </w:rPr>
-        <w:t>accidente_lugar</w:t>
-      </w:r>
-      <w:proofErr w:type="spellEnd"/>
+        <w:t xml:space="preserve"> referencia</w:t>
+      </w:r>
       <w:r>
         <w:rPr>
           <w:rFonts w:ascii="Arial" w:hAnsi="Arial" w:cs="Arial"/>
           <w:sz w:val="24"/>
           <w:szCs w:val="24"/>
         </w:rPr>
-        <w:t>}</w:t>
+        <w:t xml:space="preserve"> ${accidente_referencia}</w:t>
       </w:r>
       <w:r>
         <w:rPr>
@@ -807,7 +621,7 @@
           <w:sz w:val="24"/>
           <w:szCs w:val="24"/>
         </w:rPr>
-        <w:t xml:space="preserve"> referencia</w:t>
+        <w:t>, por encontrarse próximo al lugar donde se suscitó un accidente de tránsito (</w:t>
       </w:r>
       <w:r>
         <w:rPr>
@@ -815,77 +629,7 @@
           <w:sz w:val="24"/>
           <w:szCs w:val="24"/>
         </w:rPr>
-        <w:t xml:space="preserve"> ${</w:t>
-      </w:r>
-      <w:proofErr w:type="spellStart"/>
-      <w:r>
-        <w:rPr>
-          <w:rFonts w:ascii="Arial" w:hAnsi="Arial" w:cs="Arial"/>
-          <w:sz w:val="24"/>
-          <w:szCs w:val="24"/>
-        </w:rPr>
-        <w:t>accidente_referencia</w:t>
-      </w:r>
-      <w:proofErr w:type="spellEnd"/>
-      <w:r>
-        <w:rPr>
-          <w:rFonts w:ascii="Arial" w:hAnsi="Arial" w:cs="Arial"/>
-          <w:sz w:val="24"/>
-          <w:szCs w:val="24"/>
-        </w:rPr>
-        <w:t>}</w:t>
-      </w:r>
-      <w:r>
-        <w:rPr>
-          <w:rFonts w:ascii="Arial" w:hAnsi="Arial" w:cs="Arial"/>
-          <w:sz w:val="24"/>
-          <w:szCs w:val="24"/>
-        </w:rPr>
-        <w:t>, por encontrarse próximo al lugar donde se suscitó un accidente de tránsito (</w:t>
-      </w:r>
-      <w:r>
-        <w:rPr>
-          <w:rFonts w:ascii="Arial" w:hAnsi="Arial" w:cs="Arial"/>
-          <w:sz w:val="24"/>
-          <w:szCs w:val="24"/>
-        </w:rPr>
-        <w:t>${</w:t>
-      </w:r>
-      <w:proofErr w:type="spellStart"/>
-      <w:r>
-        <w:rPr>
-          <w:rFonts w:ascii="Arial" w:hAnsi="Arial" w:cs="Arial"/>
-          <w:sz w:val="24"/>
-          <w:szCs w:val="24"/>
-        </w:rPr>
-        <w:t>accidente_modalidad</w:t>
-      </w:r>
-      <w:proofErr w:type="spellEnd"/>
-      <w:r>
-        <w:rPr>
-          <w:rFonts w:ascii="Arial" w:hAnsi="Arial" w:cs="Arial"/>
-          <w:sz w:val="24"/>
-          <w:szCs w:val="24"/>
-        </w:rPr>
-        <w:t>} de consecuencia ${</w:t>
-      </w:r>
-      <w:proofErr w:type="spellStart"/>
-      <w:r>
-        <w:rPr>
-          <w:rFonts w:ascii="Arial" w:hAnsi="Arial" w:cs="Arial"/>
-          <w:sz w:val="24"/>
-          <w:szCs w:val="24"/>
-        </w:rPr>
-        <w:t>accidente_consecuencia</w:t>
-      </w:r>
-      <w:proofErr w:type="spellEnd"/>
-      <w:r>
-        <w:rPr>
-          <w:rFonts w:ascii="Arial" w:hAnsi="Arial" w:cs="Arial"/>
-          <w:sz w:val="24"/>
-          <w:szCs w:val="24"/>
-        </w:rPr>
-        <w:t>}</w:t>
+        <w:t>${accidente_modalidad} de consecuencia ${accidente_consecuencia}</w:t>
       </w:r>
       <w:r>
         <w:rPr>
@@ -903,101 +647,27 @@
           <w:sz w:val="24"/>
           <w:szCs w:val="24"/>
         </w:rPr>
-        <w:t>${</w:t>
-      </w:r>
-      <w:proofErr w:type="spellStart"/>
+        <w:t>${accidente_fecha_abrev}</w:t>
+      </w:r>
+      <w:r>
+        <w:rPr>
+          <w:rFonts w:ascii="Arial" w:hAnsi="Arial" w:cs="Arial"/>
+          <w:sz w:val="24"/>
+          <w:szCs w:val="24"/>
+        </w:rPr>
+        <w:t xml:space="preserve">, entre las </w:t>
+      </w:r>
       <w:r>
         <w:rPr>
           <w:rFonts w:ascii="Arial" w:hAnsi="Arial" w:cs="Arial"/>
           <w:b/>
           <w:bCs/>
-          <w:sz w:val="24"/>
-          <w:szCs w:val="24"/>
-        </w:rPr>
-        <w:t>accidente_fecha_abrev</w:t>
-      </w:r>
-      <w:proofErr w:type="spellEnd"/>
-      <w:r>
-        <w:rPr>
-          <w:rFonts w:ascii="Arial" w:hAnsi="Arial" w:cs="Arial"/>
-          <w:b/>
-          <w:bCs/>
-          <w:sz w:val="24"/>
-          <w:szCs w:val="24"/>
-        </w:rPr>
-        <w:t>}</w:t>
-      </w:r>
-      <w:r>
-        <w:rPr>
-          <w:rFonts w:ascii="Arial" w:hAnsi="Arial" w:cs="Arial"/>
-          <w:sz w:val="24"/>
-          <w:szCs w:val="24"/>
-        </w:rPr>
-        <w:t xml:space="preserve">, entre las </w:t>
-      </w:r>
-      <w:r>
-        <w:rPr>
-          <w:rFonts w:ascii="Arial" w:hAnsi="Arial" w:cs="Arial"/>
-          <w:b/>
-          <w:bCs/>
           <w:color w:val="000000" w:themeColor="text1"/>
           <w:sz w:val="24"/>
           <w:szCs w:val="24"/>
           <w:lang w:val="es-ES"/>
         </w:rPr>
-        <w:t>${</w:t>
-      </w:r>
-      <w:proofErr w:type="spellStart"/>
-      <w:r>
-        <w:rPr>
-          <w:rFonts w:ascii="Arial" w:hAnsi="Arial" w:cs="Arial"/>
-          <w:b/>
-          <w:bCs/>
-          <w:color w:val="000000" w:themeColor="text1"/>
-          <w:sz w:val="24"/>
-          <w:szCs w:val="24"/>
-          <w:lang w:val="es-ES"/>
-        </w:rPr>
-        <w:t>oficio_rango_desde</w:t>
-      </w:r>
-      <w:proofErr w:type="spellEnd"/>
-      <w:r>
-        <w:rPr>
-          <w:rFonts w:ascii="Arial" w:hAnsi="Arial" w:cs="Arial"/>
-          <w:b/>
-          <w:bCs/>
-          <w:color w:val="000000" w:themeColor="text1"/>
-          <w:sz w:val="24"/>
-          <w:szCs w:val="24"/>
-          <w:lang w:val="es-ES"/>
-        </w:rPr>
-        <w:t>} a ${</w:t>
-      </w:r>
-      <w:proofErr w:type="spellStart"/>
-      <w:r>
-        <w:rPr>
-          <w:rFonts w:ascii="Arial" w:hAnsi="Arial" w:cs="Arial"/>
-          <w:b/>
-          <w:bCs/>
-          <w:color w:val="000000" w:themeColor="text1"/>
-          <w:sz w:val="24"/>
-          <w:szCs w:val="24"/>
-          <w:lang w:val="es-ES"/>
-        </w:rPr>
-        <w:t>oficio_rango_hasta</w:t>
-      </w:r>
-      <w:proofErr w:type="spellEnd"/>
-      <w:r>
-        <w:rPr>
-          <w:rFonts w:ascii="Arial" w:hAnsi="Arial" w:cs="Arial"/>
-          <w:b/>
-          <w:bCs/>
-          <w:color w:val="000000" w:themeColor="text1"/>
-          <w:sz w:val="24"/>
-          <w:szCs w:val="24"/>
-          <w:lang w:val="es-ES"/>
-        </w:rPr>
-        <w:t>}</w:t>
+        <w:t>${oficio_rango_desde} a ${oficio_rango_hasta}</w:t>
       </w:r>
       <w:r>
         <w:rPr>
@@ -1069,23 +739,7 @@
           <w:rFonts w:ascii="Arial" w:hAnsi="Arial"/>
           <w:sz w:val="24"/>
         </w:rPr>
-        <w:t>${</w:t>
-      </w:r>
-      <w:proofErr w:type="spellStart"/>
-      <w:r>
-        <w:rPr>
-          <w:rFonts w:ascii="Arial" w:hAnsi="Arial"/>
-          <w:sz w:val="24"/>
-        </w:rPr>
-        <w:t>fiscalia_nombre</w:t>
-      </w:r>
-      <w:proofErr w:type="spellEnd"/>
-      <w:r>
-        <w:rPr>
-          <w:rFonts w:ascii="Arial" w:hAnsi="Arial"/>
-          <w:sz w:val="24"/>
-        </w:rPr>
-        <w:t>}</w:t>
+        <w:t>${fiscalia_nombre}</w:t>
       </w:r>
       <w:r>
         <w:rPr>
@@ -1305,7 +959,7 @@
         <mc:AlternateContent>
           <mc:Choice Requires="wpg">
             <w:drawing>
-              <wp:anchor distT="0" distB="0" distL="114300" distR="114300" simplePos="0" relativeHeight="251654144" behindDoc="0" locked="0" layoutInCell="1" allowOverlap="1" wp14:anchorId="3DB86D92" wp14:editId="3026B473">
+              <wp:anchor distT="0" distB="0" distL="114300" distR="114300" simplePos="0" relativeHeight="251654144" behindDoc="0" locked="0" layoutInCell="1" allowOverlap="1" wp14:anchorId="3DB86D92" wp14:editId="4F7967BD">
                 <wp:simplePos x="0" y="0"/>
                 <wp:positionH relativeFrom="column">
                   <wp:posOffset>2606357</wp:posOffset>
@@ -1717,12 +1371,12 @@
           </mc:Choice>
           <mc:Fallback>
             <w:pict>
-              <v:group w14:anchorId="3DB86D92" id="Grupo 23" o:spid="_x0000_s1026" style="position:absolute;left:0;text-align:left;margin-left:205.2pt;margin-top:1.85pt;width:93.2pt;height:103.6pt;z-index:251654144" coordorigin=",-70" coordsize="11836,13157" o:gfxdata="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">
+              <v:group w14:anchorId="3DB86D92" id="Grupo 23" o:spid="_x0000_s1026" style="position:absolute;left:0;text-align:left;margin-left:205.2pt;margin-top:1.85pt;width:93.2pt;height:103.6pt;z-index:251654144" coordorigin=",-70" coordsize="11836,13157" o:gfxdata="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">
                 <v:shapetype id="_x0000_t202" coordsize="21600,21600" o:spt="202" path="m,l,21600r21600,l21600,xe">
                   <v:stroke joinstyle="miter"/>
                   <v:path gradientshapeok="t" o:connecttype="rect"/>
                 </v:shapetype>
-                <v:shape id="Cuadro de texto 24" o:spid="_x0000_s1027" type="#_x0000_t202" style="position:absolute;top:-70;width:11836;height:13156;visibility:visible;mso-wrap-style:square;v-text-anchor:middle" o:gfxdata="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" filled="f" stroked="f">
+                <v:shape id="Cuadro de texto 24" o:spid="_x0000_s1027" type="#_x0000_t202" style="position:absolute;top:-70;width:11836;height:13156;visibility:visible;mso-wrap-style:square;v-text-anchor:middle" o:gfxdata="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" filled="f" stroked="f">
                   <v:textbox>
                     <w:txbxContent>
                       <w:p>
@@ -1765,8 +1419,8 @@
                     </w:txbxContent>
                   </v:textbox>
                 </v:shape>
-                <v:group id="Grupo 25" o:spid="_x0000_s1028" style="position:absolute;left:523;top:199;width:10631;height:10736" coordorigin=",103" coordsize="10631,10735" o:gfxdata="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">
-                  <v:shape id="Cuadro de texto 26" o:spid="_x0000_s1029" type="#_x0000_t202" style="position:absolute;top:3143;width:10511;height:7696;visibility:visible;mso-wrap-style:square;v-text-anchor:middle" o:gfxdata="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" filled="f" stroked="f">
+                <v:group id="Grupo 25" o:spid="_x0000_s1028" style="position:absolute;left:523;top:199;width:10631;height:10736" coordorigin=",103" coordsize="10631,10735" o:gfxdata="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">
+                  <v:shape id="Cuadro de texto 26" o:spid="_x0000_s1029" type="#_x0000_t202" style="position:absolute;top:3143;width:10511;height:7696;visibility:visible;mso-wrap-style:square;v-text-anchor:middle" o:gfxdata="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" filled="f" stroked="f">
                     <v:textbox>
                       <w:txbxContent>
                         <w:p>
@@ -1804,19 +1458,19 @@
                       </w:txbxContent>
                     </v:textbox>
                   </v:shape>
-                  <v:group id="Grupo 27" o:spid="_x0000_s1030" style="position:absolute;left:51;top:103;width:10580;height:10624" coordorigin="51,103" coordsize="10585,10623" o:gfxdata="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">
-                    <v:group id="Grupo 28" o:spid="_x0000_s1031" style="position:absolute;left:51;top:103;width:10586;height:10624" coordorigin="51,103" coordsize="10585,10626" o:gfxdata="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">
-                      <v:oval id="Elipse 29" o:spid="_x0000_s1032" style="position:absolute;left:51;top:103;width:10586;height:10627;visibility:visible;mso-wrap-style:square;v-text-anchor:middle" o:gfxdata="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" filled="f" strokecolor="black [3213]" strokeweight="1pt">
+                  <v:group id="Grupo 27" o:spid="_x0000_s1030" style="position:absolute;left:51;top:103;width:10580;height:10624" coordorigin="51,103" coordsize="10585,10623" o:gfxdata="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">
+                    <v:group id="Grupo 28" o:spid="_x0000_s1031" style="position:absolute;left:51;top:103;width:10586;height:10624" coordorigin="51,103" coordsize="10585,10626" o:gfxdata="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">
+                      <v:oval id="Elipse 29" o:spid="_x0000_s1032" style="position:absolute;left:51;top:103;width:10586;height:10627;visibility:visible;mso-wrap-style:square;v-text-anchor:middle" o:gfxdata="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" filled="f" strokecolor="black [3213]" strokeweight="1pt">
                         <v:stroke joinstyle="miter"/>
                       </v:oval>
-                      <v:oval id="Elipse 30" o:spid="_x0000_s1033" style="position:absolute;left:1841;top:1973;width:6938;height:6874;visibility:visible;mso-wrap-style:square;v-text-anchor:middle" o:gfxdata="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" filled="f" strokecolor="black [3213]" strokeweight="1.5pt">
+                      <v:oval id="Elipse 30" o:spid="_x0000_s1033" style="position:absolute;left:1841;top:1973;width:6938;height:6874;visibility:visible;mso-wrap-style:square;v-text-anchor:middle" o:gfxdata="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" filled="f" strokecolor="black [3213]" strokeweight="1.5pt">
                         <v:stroke linestyle="thickThin" joinstyle="miter"/>
                       </v:oval>
-                      <v:oval id="Elipse 31" o:spid="_x0000_s1034" style="position:absolute;left:296;top:296;width:10032;height:10097;visibility:visible;mso-wrap-style:square;v-text-anchor:middle" o:gfxdata="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" filled="f" strokecolor="black [3213]" strokeweight=".5pt">
+                      <v:oval id="Elipse 31" o:spid="_x0000_s1034" style="position:absolute;left:296;top:296;width:10032;height:10097;visibility:visible;mso-wrap-style:square;v-text-anchor:middle" o:gfxdata="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" filled="f" strokecolor="black [3213]" strokeweight=".5pt">
                         <v:stroke joinstyle="miter"/>
                       </v:oval>
                     </v:group>
-                    <v:group id="Grupo 32" o:spid="_x0000_s1035" style="position:absolute;left:2078;top:1900;width:6563;height:5609" coordsize="6805,5609" o:gfxdata="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">
+                    <v:group id="Grupo 32" o:spid="_x0000_s1035" style="position:absolute;left:2078;top:1900;width:6563;height:5609" coordsize="6805,5609" o:gfxdata="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">
                       <v:shapetype id="_x0000_t75" coordsize="21600,21600" o:spt="75" o:preferrelative="t" path="m@4@5l@4@11@9@11@9@5xe" filled="f" stroked="f">
                         <v:stroke joinstyle="miter"/>
                         <v:formulas>
@@ -1836,10 +1490,10 @@
                         <v:path o:extrusionok="f" gradientshapeok="t" o:connecttype="rect"/>
                         <o:lock v:ext="edit" aspectratio="t"/>
                       </v:shapetype>
-                      <v:shape id="Imagen 33" o:spid="_x0000_s1036" type="#_x0000_t75" style="position:absolute;left:1597;top:1767;width:3607;height:3842;visibility:visible;mso-wrap-style:square" o:gfxdata="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">
+                      <v:shape id="Imagen 33" o:spid="_x0000_s1036" type="#_x0000_t75" style="position:absolute;left:1597;top:1767;width:3607;height:3842;visibility:visible;mso-wrap-style:square" o:gfxdata="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">
                         <v:imagedata r:id="rId10" o:title="" grayscale="t"/>
                       </v:shape>
-                      <v:shape id="Cuadro de texto 34" o:spid="_x0000_s1037" type="#_x0000_t202" style="position:absolute;width:6805;height:4314;visibility:visible;mso-wrap-style:square;v-text-anchor:top" o:gfxdata="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" filled="f" stroked="f">
+                      <v:shape id="Cuadro de texto 34" o:spid="_x0000_s1037" type="#_x0000_t202" style="position:absolute;width:6805;height:4314;visibility:visible;mso-wrap-style:square;v-text-anchor:top" o:gfxdata="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" filled="f" stroked="f">
                         <o:lock v:ext="edit" shapetype="t"/>
                         <v:textbox>
                           <w:txbxContent>
@@ -1907,7 +1561,6 @@
         </w:rPr>
         <w:t>/</w:t>
       </w:r>
-      <w:proofErr w:type="spellStart"/>
       <w:r>
         <w:rPr>
           <w:rFonts w:ascii="Arial" w:hAnsi="Arial"/>
@@ -1915,7 +1568,6 @@
         </w:rPr>
         <w:t>gms</w:t>
       </w:r>
-      <w:proofErr w:type="spellEnd"/>
     </w:p>
     <w:p>
       <w:pPr>
@@ -2417,23 +2069,7 @@
         <w:rFonts w:ascii="Calibri" w:hAnsi="Calibri"/>
         <w:sz w:val="22"/>
       </w:rPr>
-      <w:t>Carretera Panamericana Norte Km. 42 (</w:t>
-    </w:r>
-    <w:proofErr w:type="spellStart"/>
-    <w:r>
-      <w:rPr>
-        <w:rFonts w:ascii="Calibri" w:hAnsi="Calibri"/>
-        <w:sz w:val="22"/>
-      </w:rPr>
-      <w:t>alt</w:t>
-    </w:r>
-    <w:proofErr w:type="spellEnd"/>
-    <w:r>
-      <w:rPr>
-        <w:rFonts w:ascii="Calibri" w:hAnsi="Calibri"/>
-        <w:sz w:val="22"/>
-      </w:rPr>
-      <w:t>. Garita de Control SUNAT) Santa Rosa</w:t>
+      <w:t>Carretera Panamericana Norte Km. 42 (alt. Garita de Control SUNAT) Santa Rosa</w:t>
     </w:r>
   </w:p>
   <w:p>
@@ -2495,12 +2131,14 @@
       <w:rPr>
         <w:rFonts w:ascii="Calibri" w:hAnsi="Calibri"/>
         <w:sz w:val="22"/>
+        <w:lang w:val="en-US"/>
       </w:rPr>
     </w:pPr>
     <w:r>
       <w:rPr>
         <w:rFonts w:ascii="Calibri" w:hAnsi="Calibri"/>
         <w:sz w:val="22"/>
+        <w:lang w:val="en-US"/>
       </w:rPr>
       <w:t>Email</w:t>
     </w:r>
@@ -2508,22 +2146,31 @@
       <w:rPr>
         <w:rFonts w:ascii="Calibri" w:hAnsi="Calibri"/>
         <w:sz w:val="22"/>
+        <w:lang w:val="en-US"/>
       </w:rPr>
       <w:t xml:space="preserve">: </w:t>
     </w:r>
-    <w:proofErr w:type="spellStart"/>
     <w:r>
       <w:rPr>
         <w:rFonts w:ascii="Calibri" w:hAnsi="Calibri"/>
         <w:sz w:val="22"/>
-      </w:rPr>
-      <w:t>merinosancho@uiatnorte.site</w:t>
+        <w:lang w:val="en-US"/>
+      </w:rPr>
+      <w:t>31486778@policia.</w:t>
     </w:r>
-    <w:proofErr w:type="spellEnd"/>
     <w:r>
       <w:rPr>
         <w:rFonts w:ascii="Calibri" w:hAnsi="Calibri"/>
         <w:sz w:val="22"/>
+        <w:lang w:val="en-US"/>
+      </w:rPr>
+      <w:t>gob.pe</w:t>
+    </w:r>
+    <w:r>
+      <w:rPr>
+        <w:rFonts w:ascii="Calibri" w:hAnsi="Calibri"/>
+        <w:sz w:val="22"/>
+        <w:lang w:val="en-US"/>
       </w:rPr>
       <w:t>/</w:t>
     </w:r>
@@ -2531,6 +2178,7 @@
       <w:rPr>
         <w:rFonts w:ascii="Calibri" w:hAnsi="Calibri"/>
         <w:sz w:val="22"/>
+        <w:lang w:val="en-US"/>
       </w:rPr>
       <w:t>divpiat</w:t>
     </w:r>
@@ -2538,6 +2186,7 @@
       <w:rPr>
         <w:rFonts w:ascii="Calibri" w:hAnsi="Calibri"/>
         <w:sz w:val="22"/>
+        <w:lang w:val="en-US"/>
       </w:rPr>
       <w:t>.norte@</w:t>
     </w:r>
@@ -2545,6 +2194,7 @@
       <w:rPr>
         <w:rFonts w:ascii="Calibri" w:hAnsi="Calibri"/>
         <w:sz w:val="22"/>
+        <w:lang w:val="en-US"/>
       </w:rPr>
       <w:t>policia.gob.pe</w:t>
     </w:r>
@@ -2552,6 +2202,9 @@
   <w:p>
     <w:pPr>
       <w:pStyle w:val="Piedepgina"/>
+      <w:rPr>
+        <w:lang w:val="en-US"/>
+      </w:rPr>
     </w:pPr>
   </w:p>
 </w:ftr>
@@ -2587,7 +2240,7 @@
         <w:noProof/>
         <w:lang w:val="es-PE" w:eastAsia="es-PE"/>
       </w:rPr>
-      <w:pict w14:anchorId="63753964">
+      <w:pict w14:anchorId="4D835E97">
         <v:shapetype id="_x0000_t75" coordsize="21600,21600" o:spt="75" o:preferrelative="t" path="m@4@5l@4@11@9@11@9@5xe" filled="f" stroked="f">
           <v:stroke joinstyle="miter"/>
           <v:formulas>
@@ -2607,7 +2260,7 @@
           <v:path o:extrusionok="f" gradientshapeok="t" o:connecttype="rect"/>
           <o:lock v:ext="edit" aspectratio="t"/>
         </v:shapetype>
-        <v:shape id="WordPictureWatermark362026532" o:spid="_x0000_s1051" type="#_x0000_t75" alt="LOGO uiat ACABADO" style="position:absolute;margin-left:0;margin-top:0;width:438.85pt;height:439pt;z-index:-251644928;mso-wrap-edited:f;mso-width-percent:0;mso-height-percent:0;mso-position-horizontal:center;mso-position-horizontal-relative:margin;mso-position-vertical:center;mso-position-vertical-relative:margin;mso-width-percent:0;mso-height-percent:0" o:allowincell="f">
+        <v:shape id="WordPictureWatermark362026532" o:spid="_x0000_s1027" type="#_x0000_t75" alt="LOGO uiat ACABADO" style="position:absolute;margin-left:0;margin-top:0;width:438.85pt;height:439pt;z-index:-251644928;mso-wrap-edited:f;mso-width-percent:0;mso-height-percent:0;mso-position-horizontal:center;mso-position-horizontal-relative:margin;mso-position-vertical:center;mso-position-vertical-relative:margin;mso-width-percent:0;mso-height-percent:0" o:allowincell="f">
           <v:imagedata r:id="rId1" o:title="LOGO uiat ACABADO" gain="19661f" blacklevel="22938f"/>
           <w10:wrap anchorx="margin" anchory="margin"/>
         </v:shape>
@@ -2628,7 +2281,7 @@
         <w:noProof/>
         <w:lang w:val="es-PE" w:eastAsia="es-PE"/>
       </w:rPr>
-      <w:pict w14:anchorId="60024DAF">
+      <w:pict w14:anchorId="6DAC8D02">
         <v:shapetype id="_x0000_t75" coordsize="21600,21600" o:spt="75" o:preferrelative="t" path="m@4@5l@4@11@9@11@9@5xe" filled="f" stroked="f">
           <v:stroke joinstyle="miter"/>
           <v:formulas>
@@ -2648,7 +2301,7 @@
           <v:path o:extrusionok="f" gradientshapeok="t" o:connecttype="rect"/>
           <o:lock v:ext="edit" aspectratio="t"/>
         </v:shapetype>
-        <v:shape id="WordPictureWatermark362026533" o:spid="_x0000_s1050" type="#_x0000_t75" alt="LOGO uiat ACABADO" style="position:absolute;margin-left:0;margin-top:0;width:438.85pt;height:439pt;z-index:-251643904;mso-wrap-edited:f;mso-width-percent:0;mso-height-percent:0;mso-position-horizontal:center;mso-position-horizontal-relative:margin;mso-position-vertical:center;mso-position-vertical-relative:margin;mso-width-percent:0;mso-height-percent:0" o:allowincell="f">
+        <v:shape id="WordPictureWatermark362026533" o:spid="_x0000_s1026" type="#_x0000_t75" alt="LOGO uiat ACABADO" style="position:absolute;margin-left:0;margin-top:0;width:438.85pt;height:439pt;z-index:-251643904;mso-wrap-edited:f;mso-width-percent:0;mso-height-percent:0;mso-position-horizontal:center;mso-position-horizontal-relative:margin;mso-position-vertical:center;mso-position-vertical-relative:margin;mso-width-percent:0;mso-height-percent:0" o:allowincell="f">
           <v:imagedata r:id="rId1" o:title="LOGO uiat ACABADO" gain="19661f" blacklevel="22938f"/>
           <w10:wrap anchorx="margin" anchory="margin"/>
         </v:shape>
@@ -3342,7 +2995,7 @@
         <w:noProof/>
         <w:lang w:val="es-PE" w:eastAsia="es-PE"/>
       </w:rPr>
-      <w:pict w14:anchorId="5DC52BB5">
+      <w:pict w14:anchorId="36CF528B">
         <v:shapetype id="_x0000_t75" coordsize="21600,21600" o:spt="75" o:preferrelative="t" path="m@4@5l@4@11@9@11@9@5xe" filled="f" stroked="f">
           <v:stroke joinstyle="miter"/>
           <v:formulas>
@@ -3362,7 +3015,7 @@
           <v:path o:extrusionok="f" gradientshapeok="t" o:connecttype="rect"/>
           <o:lock v:ext="edit" aspectratio="t"/>
         </v:shapetype>
-        <v:shape id="WordPictureWatermark362026531" o:spid="_x0000_s1049" type="#_x0000_t75" alt="LOGO uiat ACABADO" style="position:absolute;margin-left:0;margin-top:0;width:438.85pt;height:439pt;z-index:-251645952;mso-wrap-edited:f;mso-width-percent:0;mso-height-percent:0;mso-position-horizontal:center;mso-position-horizontal-relative:margin;mso-position-vertical:center;mso-position-vertical-relative:margin;mso-width-percent:0;mso-height-percent:0" o:allowincell="f">
+        <v:shape id="WordPictureWatermark362026531" o:spid="_x0000_s1025" type="#_x0000_t75" alt="LOGO uiat ACABADO" style="position:absolute;margin-left:0;margin-top:0;width:438.85pt;height:439pt;z-index:-251645952;mso-wrap-edited:f;mso-width-percent:0;mso-height-percent:0;mso-position-horizontal:center;mso-position-horizontal-relative:margin;mso-position-vertical:center;mso-position-vertical-relative:margin;mso-width-percent:0;mso-height-percent:0" o:allowincell="f">
           <v:imagedata r:id="rId1" o:title="LOGO uiat ACABADO" gain="19661f" blacklevel="22938f"/>
           <w10:wrap anchorx="margin" anchory="margin"/>
         </v:shape>

</xml_diff>